<commit_message>
Bỏ Grafana: giám sát bằng trang Monitor trong admin + bench.js; compose còn 3 service
Co-Authored-By: Claude Fable 5.1 <noreply@anthropic.com>
Claude-Session: https://claude.ai/code/session_01PHEC9JqtDAXfCescD4czfd
</commit_message>
<xml_diff>
--- a/docs/TieuLuan_CSDL_Nhom6_PostgreSQL.docx
+++ b/docs/TieuLuan_CSDL_Nhom6_PostgreSQL.docx
@@ -1020,7 +1020,7 @@
                 <w:sz w:val="26"/>
                 <w:szCs w:val="26"/>
               </w:rPr>
-              <w:t xml:space="preserve">Phân tích nghiệp vụ; giao diện Next.js (khách hàng + quản trị); Docker, Grafana; viết chương 1, 4, kết luận; slide</w:t>
+              <w:t xml:space="preserve">Phân tích nghiệp vụ; giao diện Next.js (khách hàng + quản trị); Docker; viết chương 1, 4, kết luận; slide</w:t>
             </w:r>
           </w:p>
         </w:tc>
@@ -2670,7 +2670,7 @@
           <w:sz w:val="26"/>
           <w:szCs w:val="26"/>
         </w:rPr>
-        <w:t xml:space="preserve">	39</w:t>
+        <w:t xml:space="preserve">	40</w:t>
       </w:r>
     </w:p>
     <w:p>
@@ -2697,7 +2697,7 @@
           <w:sz w:val="26"/>
           <w:szCs w:val="26"/>
         </w:rPr>
-        <w:t xml:space="preserve">	42</w:t>
+        <w:t xml:space="preserve">	43</w:t>
       </w:r>
     </w:p>
     <w:p>
@@ -2724,7 +2724,7 @@
           <w:sz w:val="26"/>
           <w:szCs w:val="26"/>
         </w:rPr>
-        <w:t xml:space="preserve">	44</w:t>
+        <w:t xml:space="preserve">	45</w:t>
       </w:r>
     </w:p>
     <w:p>
@@ -2751,7 +2751,7 @@
           <w:sz w:val="26"/>
           <w:szCs w:val="26"/>
         </w:rPr>
-        <w:t xml:space="preserve">	46</w:t>
+        <w:t xml:space="preserve">	47</w:t>
       </w:r>
     </w:p>
     <w:p>
@@ -2778,7 +2778,7 @@
           <w:sz w:val="26"/>
           <w:szCs w:val="26"/>
         </w:rPr>
-        <w:t xml:space="preserve">	46</w:t>
+        <w:t xml:space="preserve">	47</w:t>
       </w:r>
     </w:p>
     <w:p>
@@ -2805,7 +2805,7 @@
           <w:sz w:val="26"/>
           <w:szCs w:val="26"/>
         </w:rPr>
-        <w:t xml:space="preserve">	46</w:t>
+        <w:t xml:space="preserve">	47</w:t>
       </w:r>
     </w:p>
     <w:p>
@@ -2832,7 +2832,7 @@
           <w:sz w:val="26"/>
           <w:szCs w:val="26"/>
         </w:rPr>
-        <w:t xml:space="preserve">	47</w:t>
+        <w:t xml:space="preserve">	48</w:t>
       </w:r>
     </w:p>
     <w:p>
@@ -2859,7 +2859,7 @@
           <w:sz w:val="26"/>
           <w:szCs w:val="26"/>
         </w:rPr>
-        <w:t xml:space="preserve">	49</w:t>
+        <w:t xml:space="preserve">	50</w:t>
       </w:r>
     </w:p>
     <w:p>
@@ -2886,7 +2886,7 @@
           <w:sz w:val="26"/>
           <w:szCs w:val="26"/>
         </w:rPr>
-        <w:t xml:space="preserve">	50</w:t>
+        <w:t xml:space="preserve">	51</w:t>
       </w:r>
     </w:p>
     <w:p>
@@ -2913,7 +2913,7 @@
           <w:sz w:val="26"/>
           <w:szCs w:val="26"/>
         </w:rPr>
-        <w:t xml:space="preserve">	50</w:t>
+        <w:t xml:space="preserve">	51</w:t>
       </w:r>
     </w:p>
     <w:p>
@@ -2940,7 +2940,7 @@
           <w:sz w:val="26"/>
           <w:szCs w:val="26"/>
         </w:rPr>
-        <w:t xml:space="preserve">	52</w:t>
+        <w:t xml:space="preserve">	53</w:t>
       </w:r>
     </w:p>
     <w:p>
@@ -2967,7 +2967,7 @@
           <w:sz w:val="26"/>
           <w:szCs w:val="26"/>
         </w:rPr>
-        <w:t xml:space="preserve">	52</w:t>
+        <w:t xml:space="preserve">	53</w:t>
       </w:r>
     </w:p>
     <w:p>
@@ -2994,7 +2994,7 @@
           <w:sz w:val="26"/>
           <w:szCs w:val="26"/>
         </w:rPr>
-        <w:t xml:space="preserve">	53</w:t>
+        <w:t xml:space="preserve">	54</w:t>
       </w:r>
     </w:p>
     <w:p>
@@ -3021,7 +3021,7 @@
           <w:sz w:val="26"/>
           <w:szCs w:val="26"/>
         </w:rPr>
-        <w:t xml:space="preserve">	53</w:t>
+        <w:t xml:space="preserve">	54</w:t>
       </w:r>
     </w:p>
     <w:p>
@@ -3048,7 +3048,7 @@
           <w:sz w:val="26"/>
           <w:szCs w:val="26"/>
         </w:rPr>
-        <w:t xml:space="preserve">	54</w:t>
+        <w:t xml:space="preserve">	55</w:t>
       </w:r>
     </w:p>
     <w:p>
@@ -3075,7 +3075,7 @@
           <w:sz w:val="26"/>
           <w:szCs w:val="26"/>
         </w:rPr>
-        <w:t xml:space="preserve">	55</w:t>
+        <w:t xml:space="preserve">	56</w:t>
       </w:r>
     </w:p>
     <w:p>
@@ -3102,7 +3102,7 @@
           <w:sz w:val="26"/>
           <w:szCs w:val="26"/>
         </w:rPr>
-        <w:t xml:space="preserve">	55</w:t>
+        <w:t xml:space="preserve">	56</w:t>
       </w:r>
     </w:p>
     <w:p>
@@ -3129,7 +3129,7 @@
           <w:sz w:val="26"/>
           <w:szCs w:val="26"/>
         </w:rPr>
-        <w:t xml:space="preserve">	55</w:t>
+        <w:t xml:space="preserve">	56</w:t>
       </w:r>
     </w:p>
     <w:p>
@@ -3156,7 +3156,7 @@
           <w:sz w:val="26"/>
           <w:szCs w:val="26"/>
         </w:rPr>
-        <w:t xml:space="preserve">	55</w:t>
+        <w:t xml:space="preserve">	56</w:t>
       </w:r>
     </w:p>
     <w:p>
@@ -3474,7 +3474,7 @@
           <w:sz w:val="26"/>
           <w:szCs w:val="26"/>
         </w:rPr>
-        <w:t xml:space="preserve">	39</w:t>
+        <w:t xml:space="preserve">	40</w:t>
       </w:r>
     </w:p>
     <w:p>
@@ -3501,7 +3501,7 @@
           <w:sz w:val="26"/>
           <w:szCs w:val="26"/>
         </w:rPr>
-        <w:t xml:space="preserve">	41</w:t>
+        <w:t xml:space="preserve">	42</w:t>
       </w:r>
     </w:p>
     <w:p>
@@ -3528,7 +3528,7 @@
           <w:sz w:val="26"/>
           <w:szCs w:val="26"/>
         </w:rPr>
-        <w:t xml:space="preserve">	41</w:t>
+        <w:t xml:space="preserve">	42</w:t>
       </w:r>
     </w:p>
     <w:p>
@@ -3555,7 +3555,7 @@
           <w:sz w:val="26"/>
           <w:szCs w:val="26"/>
         </w:rPr>
-        <w:t xml:space="preserve">	42</w:t>
+        <w:t xml:space="preserve">	43</w:t>
       </w:r>
     </w:p>
     <w:p>
@@ -3582,7 +3582,7 @@
           <w:sz w:val="26"/>
           <w:szCs w:val="26"/>
         </w:rPr>
-        <w:t xml:space="preserve">	43</w:t>
+        <w:t xml:space="preserve">	44</w:t>
       </w:r>
     </w:p>
     <w:p>
@@ -3609,7 +3609,7 @@
           <w:sz w:val="26"/>
           <w:szCs w:val="26"/>
         </w:rPr>
-        <w:t xml:space="preserve">	44</w:t>
+        <w:t xml:space="preserve">	45</w:t>
       </w:r>
     </w:p>
     <w:p>
@@ -3636,7 +3636,7 @@
           <w:sz w:val="26"/>
           <w:szCs w:val="26"/>
         </w:rPr>
-        <w:t xml:space="preserve">	49</w:t>
+        <w:t xml:space="preserve">	50</w:t>
       </w:r>
     </w:p>
     <w:p>
@@ -4062,7 +4062,7 @@
           <w:sz w:val="26"/>
           <w:szCs w:val="26"/>
         </w:rPr>
-        <w:t xml:space="preserve">	46</w:t>
+        <w:t xml:space="preserve">	47</w:t>
       </w:r>
     </w:p>
     <w:p>
@@ -4089,7 +4089,7 @@
           <w:sz w:val="26"/>
           <w:szCs w:val="26"/>
         </w:rPr>
-        <w:t xml:space="preserve">	47</w:t>
+        <w:t xml:space="preserve">	48</w:t>
       </w:r>
     </w:p>
     <w:p>
@@ -4116,7 +4116,7 @@
           <w:sz w:val="26"/>
           <w:szCs w:val="26"/>
         </w:rPr>
-        <w:t xml:space="preserve">	48</w:t>
+        <w:t xml:space="preserve">	49</w:t>
       </w:r>
     </w:p>
     <w:p>
@@ -4143,7 +4143,7 @@
           <w:sz w:val="26"/>
           <w:szCs w:val="26"/>
         </w:rPr>
-        <w:t xml:space="preserve">	50</w:t>
+        <w:t xml:space="preserve">	51</w:t>
       </w:r>
     </w:p>
     <w:p>
@@ -6156,7 +6156,7 @@
           <w:sz w:val="26"/>
           <w:szCs w:val="26"/>
         </w:rPr>
-        <w:t xml:space="preserve">Đo lường hiệu năng bằng EXPLAIN ANALYZE, pgbench và giám sát bằng pg_stat_statements, Grafana.</w:t>
+        <w:t xml:space="preserve">Đo lường hiệu năng bằng công cụ đo tự viết (EXPLAIN ANALYZE), pgbench và giám sát bằng pg_stat_statements ngay trong trang quản trị.</w:t>
       </w:r>
     </w:p>
     <w:p>
@@ -23236,7 +23236,7 @@
           <w:sz w:val="26"/>
           <w:szCs w:val="26"/>
         </w:rPr>
-        <w:t xml:space="preserve">Hệ thống theo mô hình ba tầng: trình duyệt ↔ API ↔ CSDL, đóng gói thành 4 container Docker (db, api, web, grafana). Logic nghiệp vụ quan trọng nhất (đặt hàng, huỷ đơn, thông báo) nằm trong CSDL dưới dạng hàm và trigger; API chủ yếu nhận yêu cầu, gọi SQL và trả JSON.</w:t>
+        <w:t xml:space="preserve">Hệ thống theo mô hình ba tầng: trình duyệt ↔ API ↔ CSDL, đóng gói thành 3 container Docker (db, api, web). Logic nghiệp vụ quan trọng nhất (đặt hàng, huỷ đơn, thông báo) nằm trong CSDL dưới dạng hàm và trigger; API chủ yếu nhận yêu cầu, gọi SQL và trả JSON.</w:t>
       </w:r>
     </w:p>
     <w:p>
@@ -23248,7 +23248,7 @@
       <w:r>
         <w:drawing>
           <wp:inline distT="0" distB="0" distL="0" distR="0">
-            <wp:extent cx="5581650" cy="1257300"/>
+            <wp:extent cx="5581650" cy="1743075"/>
             <wp:effectExtent t="0" r="0" b="0" l="0"/>
             <wp:docPr id="1" name="" descr="" title=""/>
             <wp:cNvGraphicFramePr>
@@ -23273,7 +23273,7 @@
                   <pic:spPr bwMode="auto">
                     <a:xfrm>
                       <a:off x="0" y="0"/>
-                      <a:ext cx="5581650" cy="1257300"/>
+                      <a:ext cx="5581650" cy="1743075"/>
                     </a:xfrm>
                     <a:prstGeom prst="rect">
                       <a:avLst/>
@@ -23818,7 +23818,7 @@
                 <w:sz w:val="26"/>
                 <w:szCs w:val="26"/>
               </w:rPr>
-              <w:t xml:space="preserve">Giám sát</w:t>
+              <w:t xml:space="preserve">Giám sát &amp; đo</w:t>
             </w:r>
           </w:p>
         </w:tc>
@@ -23846,7 +23846,7 @@
                 <w:sz w:val="26"/>
                 <w:szCs w:val="26"/>
               </w:rPr>
-              <w:t xml:space="preserve">pg_stat_statements, Grafana 11 (PostgreSQL datasource), pgbench</w:t>
+              <w:t xml:space="preserve">pg_stat_statements, pg_stat_user_*; trang Monitor trong admin; bench.js; pgbench</w:t>
             </w:r>
           </w:p>
         </w:tc>
@@ -23874,7 +23874,7 @@
                 <w:sz w:val="26"/>
                 <w:szCs w:val="26"/>
               </w:rPr>
-              <w:t xml:space="preserve">Không cần Prometheus; Grafana truy vấn thẳng các view thống kê</w:t>
+              <w:t xml:space="preserve">Mọi số liệu lấy thẳng từ view thống kê của PostgreSQL, không cần công cụ ngoài</w:t>
             </w:r>
           </w:p>
         </w:tc>
@@ -27325,7 +27325,7 @@
           <w:sz w:val="26"/>
           <w:szCs w:val="26"/>
         </w:rPr>
-        <w:t xml:space="preserve"> khai báo 4 dịch vụ. Dịch vụ </w:t>
+        <w:t xml:space="preserve"> khai báo 3 dịch vụ. Dịch vụ </w:t>
       </w:r>
       <w:r>
         <w:rPr>
@@ -27405,39 +27405,7 @@
           <w:sz w:val="26"/>
           <w:szCs w:val="26"/>
         </w:rPr>
-        <w:t xml:space="preserve"> build Next.js ở chế độ standalone; </w:t>
-      </w:r>
-      <w:r>
-        <w:rPr>
-          <w:rFonts w:ascii="Courier New" w:cs="Courier New" w:eastAsia="Courier New" w:hAnsi="Courier New"/>
-          <w:sz w:val="24"/>
-          <w:szCs w:val="24"/>
-        </w:rPr>
-        <w:t xml:space="preserve">grafana</w:t>
-      </w:r>
-      <w:r>
-        <w:rPr>
-          <w:rFonts w:ascii="Times New Roman" w:cs="Times New Roman" w:eastAsia="Times New Roman" w:hAnsi="Times New Roman"/>
-          <w:sz w:val="26"/>
-          <w:szCs w:val="26"/>
-        </w:rPr>
-        <w:t xml:space="preserve"> tự nạp datasource và dashboard từ thư mục </w:t>
-      </w:r>
-      <w:r>
-        <w:rPr>
-          <w:rFonts w:ascii="Courier New" w:cs="Courier New" w:eastAsia="Courier New" w:hAnsi="Courier New"/>
-          <w:sz w:val="24"/>
-          <w:szCs w:val="24"/>
-        </w:rPr>
-        <w:t xml:space="preserve">monitoring</w:t>
-      </w:r>
-      <w:r>
-        <w:rPr>
-          <w:rFonts w:ascii="Times New Roman" w:cs="Times New Roman" w:eastAsia="Times New Roman" w:hAnsi="Times New Roman"/>
-          <w:sz w:val="26"/>
-          <w:szCs w:val="26"/>
-        </w:rPr>
-        <w:t xml:space="preserve">. Toàn bộ hệ thống khởi động bằng một lệnh:</w:t>
+        <w:t xml:space="preserve"> build Next.js ở chế độ standalone. Toàn bộ hệ thống khởi động bằng một lệnh:</w:t>
       </w:r>
     </w:p>
     <w:p>
@@ -27515,7 +27483,7 @@
           <w:sz w:val="18"/>
           <w:szCs w:val="18"/>
         </w:rPr>
-        <w:t xml:space="preserve"># Grafana: http://localhost:3001   (admin / admin)</w:t>
+        <w:t xml:space="preserve"># Monitor: http://localhost:3000/admin/monitor</w:t>
       </w:r>
     </w:p>
     <w:p>
@@ -32119,7 +32087,7 @@
           <w:sz w:val="26"/>
           <w:szCs w:val="26"/>
         </w:rPr>
-        <w:t xml:space="preserve"> lâu ngày nên xoá) và danh sách partition (Hình 3.8). </w:t>
+        <w:t xml:space="preserve"> lâu ngày nên xoá) và danh sách partition (Hình 3.8). Toàn bộ số liệu giám sát được lấy trực tiếp từ các view thống kê của PostgreSQL qua trang </w:t>
       </w:r>
       <w:r>
         <w:rPr>
@@ -32129,15 +32097,15 @@
           <w:sz w:val="26"/>
           <w:szCs w:val="26"/>
         </w:rPr>
-        <w:t xml:space="preserve">Grafana</w:t>
-      </w:r>
-      <w:r>
-        <w:rPr>
-          <w:rFonts w:ascii="Times New Roman" w:cs="Times New Roman" w:eastAsia="Times New Roman" w:hAnsi="Times New Roman"/>
-          <w:sz w:val="26"/>
-          <w:szCs w:val="26"/>
-        </w:rPr>
-        <w:t xml:space="preserve"> được cấu hình sẵn datasource PostgreSQL và dashboard 12 panel (kết nối, dung lượng, cache hit, giao dịch, đơn theo giờ, doanh thu 30 ngày từ materialized view, top câu SQL, index usage, số dòng từng partition, sắp hết hàng), tự làm mới 10 giây, truy vấn SQL trực tiếp nên không cần Prometheus.</w:t>
+        <w:t xml:space="preserve">Monitor &amp; Benchmark</w:t>
+      </w:r>
+      <w:r>
+        <w:rPr>
+          <w:rFonts w:ascii="Times New Roman" w:cs="Times New Roman" w:eastAsia="Times New Roman" w:hAnsi="Times New Roman"/>
+          <w:sz w:val="26"/>
+          <w:szCs w:val="26"/>
+        </w:rPr>
+        <w:t xml:space="preserve"> trong giao diện quản trị (ba thẻ: Benchmark EXPLAIN có/không index, Bảng – Index – Partition, pg_stat_statements), nên không cần cài thêm công cụ giám sát bên ngoài.</w:t>
       </w:r>
     </w:p>
     <w:p>
@@ -32191,7 +32159,7 @@
           <w:sz w:val="26"/>
           <w:szCs w:val="26"/>
         </w:rPr>
-        <w:t xml:space="preserve">Tiểu luận đã xây dựng hoàn chỉnh một hệ thống bán hàng trang sức trên PostgreSQL 16 gồm lược đồ 8 bảng với đầy đủ ràng buộc, 6 file migration bằng SQL thuần, backend Node.js/Fastify không dùng ORM, frontend Next.js cho khách hàng và quản trị viên, đóng gói Docker Compose kèm Grafana. Quan trọng hơn, mỗi tính năng nổi bật của PostgreSQL được gắn với một bài toán nghiệp vụ thật và được kiểm chứng bằng số liệu:</w:t>
+        <w:t xml:space="preserve">Tiểu luận đã xây dựng hoàn chỉnh một hệ thống bán hàng trang sức trên PostgreSQL 16 gồm lược đồ 8 bảng với đầy đủ ràng buộc, 6 file migration bằng SQL thuần, backend Node.js/Fastify không dùng ORM, frontend Next.js cho khách hàng và quản trị viên, đóng gói Docker Compose. Quan trọng hơn, mỗi tính năng nổi bật của PostgreSQL được gắn với một bài toán nghiệp vụ thật và được kiểm chứng bằng số liệu:</w:t>
       </w:r>
     </w:p>
     <w:p>
@@ -32868,43 +32836,6 @@
           <w:szCs w:val="26"/>
         </w:rPr>
         <w:t xml:space="preserve">, https://nextjs.org/docs.</w:t>
-      </w:r>
-    </w:p>
-    <w:p>
-      <w:pPr>
-        <w:pStyle w:val="ListParagraph"/>
-        <w:numPr>
-          <w:ilvl w:val="0"/>
-          <w:numId w:val="3"/>
-        </w:numPr>
-        <w:spacing w:after="60" w:line="360" w:lineRule="auto"/>
-        <w:jc w:val="both"/>
-      </w:pPr>
-      <w:r>
-        <w:rPr>
-          <w:rFonts w:ascii="Times New Roman" w:cs="Times New Roman" w:eastAsia="Times New Roman" w:hAnsi="Times New Roman"/>
-          <w:sz w:val="26"/>
-          <w:szCs w:val="26"/>
-        </w:rPr>
-        <w:t xml:space="preserve">Grafana Labs, </w:t>
-      </w:r>
-      <w:r>
-        <w:rPr>
-          <w:rFonts w:ascii="Times New Roman" w:cs="Times New Roman" w:eastAsia="Times New Roman" w:hAnsi="Times New Roman"/>
-          <w:i/>
-          <w:iCs/>
-          <w:sz w:val="26"/>
-          <w:szCs w:val="26"/>
-        </w:rPr>
-        <w:t xml:space="preserve">PostgreSQL data source</w:t>
-      </w:r>
-      <w:r>
-        <w:rPr>
-          <w:rFonts w:ascii="Times New Roman" w:cs="Times New Roman" w:eastAsia="Times New Roman" w:hAnsi="Times New Roman"/>
-          <w:sz w:val="26"/>
-          <w:szCs w:val="26"/>
-        </w:rPr>
-        <w:t xml:space="preserve">, https://grafana.com/docs/grafana/latest/datasources/postgres/.</w:t>
       </w:r>
     </w:p>
     <w:p>
@@ -33400,25 +33331,6 @@
           <w:szCs w:val="18"/>
         </w:rPr>
         <w:t xml:space="preserve">├── web/app/admin/…         trang quản trị</w:t>
-      </w:r>
-    </w:p>
-    <w:p>
-      <w:pPr>
-        <w:keepLines/>
-        <w:pBdr>
-          <w:left w:val="single" w:color="B8902E" w:sz="12" w:space="4"/>
-        </w:pBdr>
-        <w:shd w:fill="F3F3F3" w:color="auto" w:val="clear"/>
-        <w:spacing w:after="0" w:before="0" w:line="240" w:lineRule="auto"/>
-        <w:ind w:left="170" w:right="170"/>
-      </w:pPr>
-      <w:r>
-        <w:rPr>
-          <w:rFonts w:ascii="Courier New" w:cs="Courier New" w:eastAsia="Courier New" w:hAnsi="Courier New"/>
-          <w:sz w:val="18"/>
-          <w:szCs w:val="18"/>
-        </w:rPr>
-        <w:t xml:space="preserve">├── monitoring/grafana/     datasource + dashboard</w:t>
       </w:r>
     </w:p>
     <w:p>

</xml_diff>